<commit_message>
Mise a jour automatique de la collection et de la page Wanted
</commit_message>
<xml_diff>
--- a/GitHub Pages.docx
+++ b/GitHub Pages.docx
@@ -326,6 +326,39 @@
           <w:bCs/>
         </w:rPr>
       </w:pPr>
+    </w:p>
+    <w:p>
+      <w:pPr>
+        <w:rPr>
+          <w:b/>
+          <w:bCs/>
+        </w:rPr>
+      </w:pPr>
+    </w:p>
+    <w:p>
+      <w:pPr>
+        <w:rPr>
+          <w:b/>
+          <w:bCs/>
+        </w:rPr>
+      </w:pPr>
+    </w:p>
+    <w:p>
+      <w:pPr>
+        <w:rPr>
+          <w:b/>
+          <w:bCs/>
+        </w:rPr>
+      </w:pPr>
+    </w:p>
+    <w:p>
+      <w:pPr>
+        <w:ind w:firstLine="360"/>
+        <w:rPr>
+          <w:b/>
+          <w:bCs/>
+        </w:rPr>
+      </w:pPr>
       <w:r>
         <w:rPr>
           <w:b/>
@@ -399,6 +432,7 @@
     </w:p>
     <w:p>
       <w:r>
+        <w:lastRenderedPageBreak/>
         <w:t>Bash</w:t>
       </w:r>
     </w:p>
@@ -416,11 +450,12 @@
       <w:r>
         <w:t xml:space="preserve"> config --global user.name "</w:t>
       </w:r>
-      <w:proofErr w:type="spellStart"/>
-      <w:r>
-        <w:t>VotrePseudoGitHub</w:t>
-      </w:r>
-      <w:proofErr w:type="spellEnd"/>
+      <w:r>
+        <w:t xml:space="preserve"> </w:t>
+      </w:r>
+      <w:r>
+        <w:t>pilou69dudu-web</w:t>
+      </w:r>
       <w:r>
         <w:t>"</w:t>
       </w:r>
@@ -440,7 +475,22 @@
       </w:r>
       <w:proofErr w:type="spellEnd"/>
       <w:r>
-        <w:t xml:space="preserve"> "votre-email@exemple.com"</w:t>
+        <w:t xml:space="preserve"> "</w:t>
+      </w:r>
+      <w:r>
+        <w:t xml:space="preserve"> </w:t>
+      </w:r>
+      <w:r>
+        <w:t>pilou69dudu</w:t>
+      </w:r>
+      <w:r>
+        <w:t>@</w:t>
+      </w:r>
+      <w:r>
+        <w:t>gmail</w:t>
+      </w:r>
+      <w:r>
+        <w:t>.com"</w:t>
       </w:r>
     </w:p>
     <w:p/>
@@ -842,6 +892,7 @@
     </w:p>
     <w:p>
       <w:r>
+        <w:lastRenderedPageBreak/>
         <w:t>DOS</w:t>
       </w:r>
     </w:p>
@@ -878,7 +929,6 @@
       <w:proofErr w:type="spellStart"/>
       <w:proofErr w:type="gramStart"/>
       <w:r>
-        <w:lastRenderedPageBreak/>
         <w:t>echo</w:t>
       </w:r>
       <w:proofErr w:type="spellEnd"/>
@@ -1147,6 +1197,7 @@
         </w:numPr>
       </w:pPr>
       <w:r>
+        <w:lastRenderedPageBreak/>
         <w:t>Git prend le relais immédiatement et envoie l'HTML et les nouvelles images sur votre espace GitHub.</w:t>
       </w:r>
     </w:p>
@@ -2700,6 +2751,18 @@
       <w:shd w:val="clear" w:color="auto" w:fill="E1DFDD"/>
     </w:rPr>
   </w:style>
+  <w:style w:type="character" w:styleId="Lienhypertextesuivivisit">
+    <w:name w:val="FollowedHyperlink"/>
+    <w:basedOn w:val="Policepardfaut"/>
+    <w:uiPriority w:val="99"/>
+    <w:semiHidden/>
+    <w:unhideWhenUsed/>
+    <w:rsid w:val="00F033A6"/>
+    <w:rPr>
+      <w:color w:val="954F72" w:themeColor="followedHyperlink"/>
+      <w:u w:val="single"/>
+    </w:rPr>
+  </w:style>
 </w:styles>
 </file>
 

</xml_diff>